<commit_message>
ISAS: reports for lab1 and lab2 fixed
</commit_message>
<xml_diff>
--- a/ISAS/Reports/Report_1.docx
+++ b/ISAS/Reports/Report_1.docx
@@ -478,7 +478,7 @@
     </w:p>
     <w:p>
       <w:pPr>
-        <w:jc w:val="right"/>
+        <w:jc w:val="center"/>
         <w:rPr>
           <w:sz w:val="28"/>
           <w:szCs w:val="28"/>
@@ -595,6 +595,8 @@
     </w:p>
     <w:p>
       <w:pPr>
+        <w:ind w:firstLine="709"/>
+        <w:jc w:val="center"/>
         <w:rPr>
           <w:sz w:val="28"/>
           <w:szCs w:val="28"/>
@@ -625,8 +627,8 @@
           <w:ilvl w:val="0"/>
           <w:numId w:val="1"/>
         </w:numPr>
-        <w:spacing w:after="360"/>
-        <w:ind w:left="720"/>
+        <w:spacing w:after="240"/>
+        <w:ind w:left="0" w:firstLine="709"/>
         <w:jc w:val="both"/>
         <w:rPr>
           <w:rFonts w:ascii="Times New Roman" w:hAnsi="Times New Roman" w:cs="Times New Roman"/>
@@ -652,7 +654,7 @@
     </w:p>
     <w:p>
       <w:pPr>
-        <w:ind w:left="360" w:firstLine="348"/>
+        <w:ind w:firstLine="709"/>
         <w:jc w:val="both"/>
         <w:rPr>
           <w:sz w:val="28"/>
@@ -753,38 +755,21 @@
           <w:sz w:val="28"/>
           <w:szCs w:val="28"/>
         </w:rPr>
-        <w:t xml:space="preserve">. </w:t>
-      </w:r>
-    </w:p>
-    <w:p>
-      <w:pPr>
-        <w:spacing w:after="240"/>
-        <w:ind w:left="360" w:firstLine="348"/>
+        <w:t>. Данный этап настройки показан на рисунке 1.1</w:t>
+      </w:r>
+      <w:r>
+        <w:rPr>
+          <w:sz w:val="28"/>
+          <w:szCs w:val="28"/>
+        </w:rPr>
+        <w:t>.</w:t>
+      </w:r>
+    </w:p>
+    <w:p>
+      <w:pPr>
+        <w:spacing w:before="240" w:after="120"/>
+        <w:ind w:firstLine="709"/>
         <w:jc w:val="both"/>
-        <w:rPr>
-          <w:sz w:val="28"/>
-          <w:szCs w:val="28"/>
-        </w:rPr>
-      </w:pPr>
-      <w:r>
-        <w:rPr>
-          <w:sz w:val="28"/>
-          <w:szCs w:val="28"/>
-        </w:rPr>
-        <w:t>Данный этап настройки показан на рисунке 1.1</w:t>
-      </w:r>
-      <w:r>
-        <w:rPr>
-          <w:sz w:val="28"/>
-          <w:szCs w:val="28"/>
-        </w:rPr>
-        <w:t>.</w:t>
-      </w:r>
-    </w:p>
-    <w:p>
-      <w:pPr>
-        <w:spacing w:after="240"/>
-        <w:jc w:val="center"/>
         <w:rPr>
           <w:sz w:val="28"/>
           <w:szCs w:val="28"/>
@@ -835,7 +820,7 @@
     </w:p>
     <w:p>
       <w:pPr>
-        <w:spacing w:after="240"/>
+        <w:ind w:firstLine="709"/>
         <w:jc w:val="center"/>
         <w:rPr>
           <w:sz w:val="28"/>
@@ -852,7 +837,8 @@
     </w:p>
     <w:p>
       <w:pPr>
-        <w:spacing w:after="240"/>
+        <w:spacing w:before="240"/>
+        <w:ind w:firstLine="708"/>
         <w:jc w:val="both"/>
         <w:rPr>
           <w:sz w:val="28"/>
@@ -864,13 +850,33 @@
           <w:sz w:val="28"/>
           <w:szCs w:val="28"/>
         </w:rPr>
-        <w:tab/>
-        <w:t>После этого необходимо выделить этой виртуальной машине необходимое для корректной работы количество ресурсов компьютера. Данный этап представлен на рисунках 1.2 и 1.3.</w:t>
-      </w:r>
-    </w:p>
-    <w:p>
-      <w:pPr>
-        <w:spacing w:after="240"/>
+        <w:t xml:space="preserve">После этого необходимо выделить этой виртуальной машине необходимое для корректной работы количество ресурсов компьютера. </w:t>
+      </w:r>
+      <w:r>
+        <w:rPr>
+          <w:sz w:val="28"/>
+          <w:szCs w:val="28"/>
+        </w:rPr>
+        <w:t xml:space="preserve">Выделим для начала необходимый объём ОЗУ. </w:t>
+      </w:r>
+      <w:r>
+        <w:rPr>
+          <w:sz w:val="28"/>
+          <w:szCs w:val="28"/>
+        </w:rPr>
+        <w:t>Данный этап представлен на рисунках 1.2</w:t>
+      </w:r>
+      <w:r>
+        <w:rPr>
+          <w:sz w:val="28"/>
+          <w:szCs w:val="28"/>
+        </w:rPr>
+        <w:t>.</w:t>
+      </w:r>
+    </w:p>
+    <w:p>
+      <w:pPr>
+        <w:spacing w:before="240" w:after="120"/>
         <w:jc w:val="center"/>
         <w:rPr>
           <w:sz w:val="28"/>
@@ -884,7 +890,7 @@
           <w:szCs w:val="28"/>
         </w:rPr>
         <w:drawing>
-          <wp:inline distT="0" distB="0" distL="0" distR="0" wp14:anchorId="6769E9AD" wp14:editId="103598A0">
+          <wp:inline distT="0" distB="0" distL="0" distR="0" wp14:anchorId="604853BF" wp14:editId="09C22575">
             <wp:extent cx="6372225" cy="1577975"/>
             <wp:effectExtent l="0" t="0" r="9525" b="3175"/>
             <wp:docPr id="2" name="Рисунок 2"/>
@@ -922,7 +928,7 @@
     </w:p>
     <w:p>
       <w:pPr>
-        <w:spacing w:after="240"/>
+        <w:ind w:firstLine="709"/>
         <w:jc w:val="center"/>
         <w:rPr>
           <w:sz w:val="28"/>
@@ -939,7 +945,23 @@
     </w:p>
     <w:p>
       <w:pPr>
-        <w:spacing w:after="240"/>
+        <w:ind w:firstLine="708"/>
+        <w:rPr>
+          <w:sz w:val="28"/>
+          <w:szCs w:val="28"/>
+        </w:rPr>
+      </w:pPr>
+      <w:r>
+        <w:rPr>
+          <w:sz w:val="28"/>
+          <w:szCs w:val="28"/>
+        </w:rPr>
+        <w:t>Следующим шагом выделим достаточный объём жёсткого диска для системы. Данный этап представлен на рисунке 1.3</w:t>
+      </w:r>
+    </w:p>
+    <w:p>
+      <w:pPr>
+        <w:ind w:firstLine="709"/>
         <w:jc w:val="center"/>
         <w:rPr>
           <w:sz w:val="28"/>
@@ -992,7 +1014,7 @@
     </w:p>
     <w:p>
       <w:pPr>
-        <w:spacing w:after="240"/>
+        <w:ind w:firstLine="709"/>
         <w:jc w:val="center"/>
         <w:rPr>
           <w:sz w:val="28"/>
@@ -1009,7 +1031,8 @@
     </w:p>
     <w:p>
       <w:pPr>
-        <w:spacing w:after="240"/>
+        <w:spacing w:before="240"/>
+        <w:ind w:firstLine="708"/>
         <w:jc w:val="both"/>
         <w:rPr>
           <w:sz w:val="28"/>
@@ -1021,13 +1044,6 @@
           <w:sz w:val="28"/>
           <w:szCs w:val="28"/>
         </w:rPr>
-        <w:tab/>
-      </w:r>
-      <w:r>
-        <w:rPr>
-          <w:sz w:val="28"/>
-          <w:szCs w:val="28"/>
-        </w:rPr>
         <w:t xml:space="preserve">В ходе выполнения лабораторной работы будет использоваться </w:t>
       </w:r>
       <w:r>
@@ -1077,7 +1093,7 @@
     </w:p>
     <w:p>
       <w:pPr>
-        <w:spacing w:after="240"/>
+        <w:spacing w:before="240" w:after="120"/>
         <w:jc w:val="center"/>
         <w:rPr>
           <w:sz w:val="28"/>
@@ -1091,7 +1107,7 @@
           <w:szCs w:val="28"/>
         </w:rPr>
         <w:drawing>
-          <wp:inline distT="0" distB="0" distL="0" distR="0" wp14:anchorId="56D9C32D" wp14:editId="303D52E5">
+          <wp:inline distT="0" distB="0" distL="0" distR="0" wp14:anchorId="6A830814" wp14:editId="3FD9CFF1">
             <wp:extent cx="5181600" cy="3089339"/>
             <wp:effectExtent l="0" t="0" r="0" b="0"/>
             <wp:docPr id="4" name="Рисунок 4"/>
@@ -1129,7 +1145,7 @@
     </w:p>
     <w:p>
       <w:pPr>
-        <w:spacing w:after="240"/>
+        <w:ind w:firstLine="709"/>
         <w:jc w:val="center"/>
         <w:rPr>
           <w:sz w:val="28"/>
@@ -1151,7 +1167,8 @@
           <w:ilvl w:val="0"/>
           <w:numId w:val="1"/>
         </w:numPr>
-        <w:spacing w:after="360"/>
+        <w:spacing w:after="240"/>
+        <w:ind w:left="0" w:firstLine="709"/>
         <w:jc w:val="both"/>
         <w:rPr>
           <w:rFonts w:ascii="Times New Roman" w:hAnsi="Times New Roman" w:cs="Times New Roman"/>
@@ -1172,7 +1189,6 @@
           <w:sz w:val="28"/>
           <w:szCs w:val="28"/>
         </w:rPr>
-        <w:lastRenderedPageBreak/>
         <w:t xml:space="preserve">Установка ОС </w:t>
       </w:r>
       <w:r>
@@ -1213,7 +1229,7 @@
     </w:p>
     <w:p>
       <w:pPr>
-        <w:ind w:left="708" w:firstLine="361"/>
+        <w:ind w:firstLine="709"/>
         <w:jc w:val="both"/>
         <w:rPr>
           <w:sz w:val="28"/>
@@ -1267,7 +1283,7 @@
     </w:p>
     <w:p>
       <w:pPr>
-        <w:ind w:left="708" w:firstLine="361"/>
+        <w:ind w:firstLine="709"/>
         <w:jc w:val="both"/>
         <w:rPr>
           <w:sz w:val="28"/>
@@ -1279,6 +1295,7 @@
           <w:sz w:val="28"/>
           <w:szCs w:val="28"/>
         </w:rPr>
+        <w:lastRenderedPageBreak/>
         <w:t xml:space="preserve">В процессе установки необходимо установить параметры сетевых подключений так, чтобы сетевые настройки устанавливались с помощью </w:t>
       </w:r>
       <w:r>
@@ -1299,7 +1316,7 @@
     </w:p>
     <w:p>
       <w:pPr>
-        <w:spacing w:before="240" w:after="240"/>
+        <w:spacing w:before="240" w:after="120"/>
         <w:jc w:val="center"/>
         <w:rPr>
           <w:sz w:val="28"/>
@@ -1313,7 +1330,7 @@
           <w:szCs w:val="28"/>
         </w:rPr>
         <w:drawing>
-          <wp:inline distT="0" distB="0" distL="0" distR="0" wp14:anchorId="533163B3" wp14:editId="63AFEF7E">
+          <wp:inline distT="0" distB="0" distL="0" distR="0" wp14:anchorId="59897699" wp14:editId="0997B3A9">
             <wp:extent cx="5166360" cy="3852503"/>
             <wp:effectExtent l="0" t="0" r="0" b="0"/>
             <wp:docPr id="5" name="Рисунок 5"/>
@@ -1351,7 +1368,7 @@
     </w:p>
     <w:p>
       <w:pPr>
-        <w:spacing w:before="240" w:after="240"/>
+        <w:ind w:firstLine="709"/>
         <w:jc w:val="center"/>
         <w:rPr>
           <w:sz w:val="28"/>
@@ -1368,7 +1385,8 @@
     </w:p>
     <w:p>
       <w:pPr>
-        <w:spacing w:before="240" w:after="240"/>
+        <w:spacing w:before="240"/>
+        <w:ind w:firstLine="708"/>
         <w:jc w:val="both"/>
         <w:rPr>
           <w:sz w:val="28"/>
@@ -1380,7 +1398,6 @@
           <w:sz w:val="28"/>
           <w:szCs w:val="28"/>
         </w:rPr>
-        <w:tab/>
         <w:t xml:space="preserve">Так как </w:t>
       </w:r>
       <w:r>
@@ -1425,12 +1442,26 @@
           <w:sz w:val="28"/>
           <w:szCs w:val="28"/>
         </w:rPr>
-        <w:t xml:space="preserve"> – в настройке прокси адрес прокси-сервера устанавливать не требуется. Данный этап настройки системы представлен на рисунке 2.2.</w:t>
-      </w:r>
-    </w:p>
-    <w:p>
-      <w:pPr>
-        <w:spacing w:before="240" w:after="240"/>
+        <w:t xml:space="preserve"> – в настройке прокси адрес прокси-сервера устанавливать не требуется. </w:t>
+      </w:r>
+      <w:r>
+        <w:rPr>
+          <w:sz w:val="28"/>
+          <w:szCs w:val="28"/>
+        </w:rPr>
+        <w:t xml:space="preserve">Поэтому, пропустим данный этап установки и оставим окно ввода адреса прокси-сервера пустым. </w:t>
+      </w:r>
+      <w:r>
+        <w:rPr>
+          <w:sz w:val="28"/>
+          <w:szCs w:val="28"/>
+        </w:rPr>
+        <w:t>Данный этап настройки системы представлен на рисунке 2.2.</w:t>
+      </w:r>
+    </w:p>
+    <w:p>
+      <w:pPr>
+        <w:spacing w:before="240" w:after="120"/>
         <w:jc w:val="center"/>
         <w:rPr>
           <w:sz w:val="28"/>
@@ -1445,7 +1476,7 @@
         </w:rPr>
         <w:lastRenderedPageBreak/>
         <w:drawing>
-          <wp:inline distT="0" distB="0" distL="0" distR="0" wp14:anchorId="1F443FBA" wp14:editId="544F8C68">
+          <wp:inline distT="0" distB="0" distL="0" distR="0" wp14:anchorId="157B7AF0" wp14:editId="3D27FCBD">
             <wp:extent cx="5067300" cy="3716525"/>
             <wp:effectExtent l="0" t="0" r="0" b="0"/>
             <wp:docPr id="6" name="Рисунок 6"/>
@@ -1483,7 +1514,7 @@
     </w:p>
     <w:p>
       <w:pPr>
-        <w:spacing w:before="240" w:after="240"/>
+        <w:ind w:firstLine="709"/>
         <w:jc w:val="center"/>
         <w:rPr>
           <w:sz w:val="28"/>
@@ -1500,7 +1531,8 @@
     </w:p>
     <w:p>
       <w:pPr>
-        <w:spacing w:before="240" w:after="240"/>
+        <w:spacing w:before="240"/>
+        <w:ind w:firstLine="708"/>
         <w:jc w:val="both"/>
         <w:rPr>
           <w:sz w:val="28"/>
@@ -1512,19 +1544,27 @@
           <w:sz w:val="28"/>
           <w:szCs w:val="28"/>
         </w:rPr>
-        <w:tab/>
-      </w:r>
-      <w:r>
-        <w:rPr>
-          <w:sz w:val="28"/>
-          <w:szCs w:val="28"/>
-        </w:rPr>
-        <w:t>Далее выбираем весь выделенный под виртуальную машину объём жёсткого диска и выбираем его для разметки. Данный этап показан на рисунках 2.3.и 2.4.</w:t>
-      </w:r>
-    </w:p>
-    <w:p>
-      <w:pPr>
-        <w:spacing w:before="240" w:after="240"/>
+        <w:t>Далее выбираем весь выделенный под виртуальную машину объём жёсткого диска и выбираем его для разметки. Данный этап показан на рисунк</w:t>
+      </w:r>
+      <w:r>
+        <w:rPr>
+          <w:sz w:val="28"/>
+          <w:szCs w:val="28"/>
+        </w:rPr>
+        <w:t>е</w:t>
+      </w:r>
+      <w:r>
+        <w:rPr>
+          <w:sz w:val="28"/>
+          <w:szCs w:val="28"/>
+        </w:rPr>
+        <w:t xml:space="preserve"> 2.3.</w:t>
+      </w:r>
+    </w:p>
+    <w:p>
+      <w:pPr>
+        <w:spacing w:before="240" w:after="120"/>
+        <w:ind w:firstLine="709"/>
         <w:jc w:val="center"/>
         <w:rPr>
           <w:sz w:val="28"/>
@@ -1576,7 +1616,7 @@
     </w:p>
     <w:p>
       <w:pPr>
-        <w:spacing w:before="240" w:after="240"/>
+        <w:ind w:firstLine="709"/>
         <w:jc w:val="center"/>
         <w:rPr>
           <w:sz w:val="28"/>
@@ -1593,7 +1633,25 @@
     </w:p>
     <w:p>
       <w:pPr>
-        <w:spacing w:before="240" w:after="240"/>
+        <w:spacing w:before="240"/>
+        <w:ind w:firstLine="708"/>
+        <w:rPr>
+          <w:sz w:val="28"/>
+          <w:szCs w:val="28"/>
+        </w:rPr>
+      </w:pPr>
+      <w:r>
+        <w:rPr>
+          <w:sz w:val="28"/>
+          <w:szCs w:val="28"/>
+        </w:rPr>
+        <w:t>После этого система сама разметит диск на предпочтительный части и предоставит их списком для изменения или одобрения без изменений. Так как никаких дополнительных манипуляций не требуется – согласимся с предлагаемым вариантом, что показано на рисунке 2.4.</w:t>
+      </w:r>
+    </w:p>
+    <w:p>
+      <w:pPr>
+        <w:spacing w:after="120"/>
+        <w:ind w:firstLine="709"/>
         <w:jc w:val="center"/>
         <w:rPr>
           <w:sz w:val="28"/>
@@ -1646,7 +1704,7 @@
     </w:p>
     <w:p>
       <w:pPr>
-        <w:spacing w:before="240" w:after="240"/>
+        <w:ind w:firstLine="709"/>
         <w:jc w:val="center"/>
         <w:rPr>
           <w:sz w:val="28"/>
@@ -1663,7 +1721,8 @@
     </w:p>
     <w:p>
       <w:pPr>
-        <w:spacing w:before="240" w:after="240"/>
+        <w:spacing w:before="240"/>
+        <w:ind w:firstLine="708"/>
         <w:jc w:val="both"/>
         <w:rPr>
           <w:sz w:val="28"/>
@@ -1675,13 +1734,13 @@
           <w:sz w:val="28"/>
           <w:szCs w:val="28"/>
         </w:rPr>
-        <w:tab/>
         <w:t>Далее настраиваем профиль администратора устанавливаемой системы (рисунок 2.5).</w:t>
       </w:r>
     </w:p>
     <w:p>
       <w:pPr>
-        <w:spacing w:before="240" w:after="240"/>
+        <w:spacing w:before="240" w:after="120"/>
+        <w:ind w:firstLine="709"/>
         <w:jc w:val="center"/>
         <w:rPr>
           <w:sz w:val="28"/>
@@ -1733,7 +1792,7 @@
     </w:p>
     <w:p>
       <w:pPr>
-        <w:spacing w:before="240" w:after="240"/>
+        <w:ind w:firstLine="709"/>
         <w:jc w:val="center"/>
         <w:rPr>
           <w:sz w:val="28"/>
@@ -1750,7 +1809,8 @@
     </w:p>
     <w:p>
       <w:pPr>
-        <w:spacing w:before="240" w:after="240"/>
+        <w:spacing w:before="240"/>
+        <w:ind w:firstLine="708"/>
         <w:jc w:val="both"/>
         <w:rPr>
           <w:sz w:val="28"/>
@@ -1762,56 +1822,70 @@
           <w:sz w:val="28"/>
           <w:szCs w:val="28"/>
         </w:rPr>
+        <w:t>Следующим шагом необходимо</w:t>
+      </w:r>
+      <w:r>
+        <w:rPr>
+          <w:sz w:val="28"/>
+          <w:szCs w:val="28"/>
+        </w:rPr>
+        <w:t xml:space="preserve"> установить</w:t>
+      </w:r>
+      <w:r>
+        <w:rPr>
+          <w:sz w:val="28"/>
+          <w:szCs w:val="28"/>
+        </w:rPr>
+        <w:t xml:space="preserve"> </w:t>
+      </w:r>
+      <w:r>
+        <w:rPr>
+          <w:sz w:val="28"/>
+          <w:szCs w:val="28"/>
+          <w:lang w:val="en-US"/>
+        </w:rPr>
+        <w:t>OpenSSH</w:t>
+      </w:r>
+      <w:r>
+        <w:rPr>
+          <w:sz w:val="28"/>
+          <w:szCs w:val="28"/>
+        </w:rPr>
+        <w:t xml:space="preserve"> </w:t>
+      </w:r>
+      <w:r>
+        <w:rPr>
+          <w:sz w:val="28"/>
+          <w:szCs w:val="28"/>
+          <w:lang w:val="en-US"/>
+        </w:rPr>
+        <w:t>server</w:t>
+      </w:r>
+      <w:r>
+        <w:rPr>
+          <w:sz w:val="28"/>
+          <w:szCs w:val="28"/>
+        </w:rPr>
+        <w:t>, для чего выбираем соответствующий пункт, предлагаемый установщиком. Данный этап настройки представлен на рисунке 2.6.</w:t>
+      </w:r>
+    </w:p>
+    <w:p>
+      <w:pPr>
+        <w:spacing w:after="120"/>
+        <w:ind w:firstLine="709"/>
+        <w:jc w:val="center"/>
+        <w:rPr>
+          <w:sz w:val="28"/>
+          <w:szCs w:val="28"/>
+        </w:rPr>
+      </w:pPr>
+      <w:r>
+        <w:rPr>
+          <w:noProof/>
+          <w:sz w:val="28"/>
+          <w:szCs w:val="28"/>
+        </w:rPr>
         <w:lastRenderedPageBreak/>
-        <w:tab/>
-        <w:t xml:space="preserve">Следующим шагом необходимо </w:t>
-      </w:r>
-      <w:r>
-        <w:rPr>
-          <w:sz w:val="28"/>
-          <w:szCs w:val="28"/>
-          <w:lang w:val="en-US"/>
-        </w:rPr>
-        <w:t>OpenSSH</w:t>
-      </w:r>
-      <w:r>
-        <w:rPr>
-          <w:sz w:val="28"/>
-          <w:szCs w:val="28"/>
-        </w:rPr>
-        <w:t xml:space="preserve"> </w:t>
-      </w:r>
-      <w:r>
-        <w:rPr>
-          <w:sz w:val="28"/>
-          <w:szCs w:val="28"/>
-          <w:lang w:val="en-US"/>
-        </w:rPr>
-        <w:t>server</w:t>
-      </w:r>
-      <w:r>
-        <w:rPr>
-          <w:sz w:val="28"/>
-          <w:szCs w:val="28"/>
-        </w:rPr>
-        <w:t>, для чего выбираем соответствующий пункт, предлагаемый установщиком. Данный этап настройки представлен на рисунке 2.6.</w:t>
-      </w:r>
-    </w:p>
-    <w:p>
-      <w:pPr>
-        <w:spacing w:before="240" w:after="240"/>
-        <w:jc w:val="center"/>
-        <w:rPr>
-          <w:sz w:val="28"/>
-          <w:szCs w:val="28"/>
-        </w:rPr>
-      </w:pPr>
-      <w:r>
-        <w:rPr>
-          <w:noProof/>
-          <w:sz w:val="28"/>
-          <w:szCs w:val="28"/>
-        </w:rPr>
         <w:drawing>
           <wp:inline distT="0" distB="0" distL="0" distR="0" wp14:anchorId="0110AF46" wp14:editId="707FA34A">
             <wp:extent cx="5265420" cy="2400300"/>
@@ -1851,7 +1925,7 @@
     </w:p>
     <w:p>
       <w:pPr>
-        <w:spacing w:before="240" w:after="240"/>
+        <w:ind w:firstLine="709"/>
         <w:jc w:val="center"/>
         <w:rPr>
           <w:sz w:val="28"/>
@@ -1891,7 +1965,7 @@
     </w:p>
     <w:p>
       <w:pPr>
-        <w:spacing w:before="240" w:after="240"/>
+        <w:spacing w:before="240"/>
         <w:ind w:firstLine="708"/>
         <w:jc w:val="both"/>
         <w:rPr>
@@ -1904,12 +1978,20 @@
           <w:sz w:val="28"/>
           <w:szCs w:val="28"/>
         </w:rPr>
+        <w:t xml:space="preserve">Далее система начнёт устанавливать все необходимые компоненты и после непродолжительного времени выдаст стартовый экран ввода логина и пароля. </w:t>
+      </w:r>
+      <w:r>
+        <w:rPr>
+          <w:sz w:val="28"/>
+          <w:szCs w:val="28"/>
+        </w:rPr>
         <w:t>Результат установки системы представлен на рисунке 2.7</w:t>
       </w:r>
     </w:p>
     <w:p>
       <w:pPr>
-        <w:spacing w:before="240" w:after="240"/>
+        <w:spacing w:before="240" w:after="120"/>
+        <w:ind w:firstLine="709"/>
         <w:jc w:val="center"/>
         <w:rPr>
           <w:sz w:val="28"/>
@@ -1961,7 +2043,7 @@
     </w:p>
     <w:p>
       <w:pPr>
-        <w:spacing w:before="240" w:after="240"/>
+        <w:ind w:firstLine="709"/>
         <w:jc w:val="center"/>
         <w:rPr>
           <w:sz w:val="28"/>
@@ -1978,7 +2060,8 @@
     </w:p>
     <w:p>
       <w:pPr>
-        <w:spacing w:before="240" w:after="240"/>
+        <w:spacing w:before="240"/>
+        <w:ind w:firstLine="708"/>
         <w:jc w:val="both"/>
         <w:rPr>
           <w:sz w:val="28"/>
@@ -1990,24 +2073,37 @@
           <w:sz w:val="28"/>
           <w:szCs w:val="28"/>
         </w:rPr>
-        <w:tab/>
-      </w:r>
-    </w:p>
-    <w:p>
-      <w:pPr>
-        <w:spacing w:before="240" w:after="240"/>
-        <w:jc w:val="both"/>
-        <w:rPr>
-          <w:sz w:val="28"/>
-          <w:szCs w:val="28"/>
-        </w:rPr>
-      </w:pPr>
-      <w:r>
-        <w:rPr>
-          <w:sz w:val="28"/>
-          <w:szCs w:val="28"/>
-        </w:rPr>
-        <w:tab/>
+        <w:t xml:space="preserve">Результатом данного раздела является установленная со всеми необходимыми компонентами система </w:t>
+      </w:r>
+      <w:r>
+        <w:rPr>
+          <w:sz w:val="28"/>
+          <w:szCs w:val="28"/>
+          <w:lang w:val="en-US"/>
+        </w:rPr>
+        <w:t>Ubuntu</w:t>
+      </w:r>
+      <w:r>
+        <w:rPr>
+          <w:sz w:val="28"/>
+          <w:szCs w:val="28"/>
+        </w:rPr>
+        <w:t xml:space="preserve"> </w:t>
+      </w:r>
+      <w:r>
+        <w:rPr>
+          <w:sz w:val="28"/>
+          <w:szCs w:val="28"/>
+          <w:lang w:val="en-US"/>
+        </w:rPr>
+        <w:t>Server</w:t>
+      </w:r>
+      <w:r>
+        <w:rPr>
+          <w:sz w:val="28"/>
+          <w:szCs w:val="28"/>
+        </w:rPr>
+        <w:t>, которая готова к дальнейшей работе согласно условию лабораторной работы.</w:t>
       </w:r>
     </w:p>
     <w:p>
@@ -2017,7 +2113,8 @@
           <w:ilvl w:val="0"/>
           <w:numId w:val="1"/>
         </w:numPr>
-        <w:spacing w:after="360"/>
+        <w:spacing w:before="0" w:after="240"/>
+        <w:ind w:left="0" w:firstLine="709"/>
         <w:jc w:val="both"/>
         <w:rPr>
           <w:rFonts w:ascii="Times New Roman" w:hAnsi="Times New Roman" w:cs="Times New Roman"/>
@@ -2056,7 +2153,7 @@
     </w:p>
     <w:p>
       <w:pPr>
-        <w:ind w:left="708" w:firstLine="361"/>
+        <w:ind w:firstLine="708"/>
         <w:jc w:val="both"/>
         <w:rPr>
           <w:sz w:val="28"/>
@@ -2077,6 +2174,7 @@
         </w:rPr>
         <w:t>/</w:t>
       </w:r>
+      <w:proofErr w:type="spellStart"/>
       <w:r>
         <w:rPr>
           <w:sz w:val="28"/>
@@ -2085,6 +2183,7 @@
         </w:rPr>
         <w:t>etc</w:t>
       </w:r>
+      <w:proofErr w:type="spellEnd"/>
       <w:r>
         <w:rPr>
           <w:sz w:val="28"/>
@@ -2092,6 +2191,7 @@
         </w:rPr>
         <w:t>/</w:t>
       </w:r>
+      <w:proofErr w:type="spellStart"/>
       <w:r>
         <w:rPr>
           <w:sz w:val="28"/>
@@ -2100,6 +2200,7 @@
         </w:rPr>
         <w:t>ssh</w:t>
       </w:r>
+      <w:proofErr w:type="spellEnd"/>
       <w:r>
         <w:rPr>
           <w:sz w:val="28"/>
@@ -2165,6 +2266,7 @@
         </w:rPr>
         <w:t xml:space="preserve"> копию файла </w:t>
       </w:r>
+      <w:proofErr w:type="spellStart"/>
       <w:r>
         <w:rPr>
           <w:sz w:val="28"/>
@@ -2173,6 +2275,7 @@
         </w:rPr>
         <w:t>sshd</w:t>
       </w:r>
+      <w:proofErr w:type="spellEnd"/>
       <w:r>
         <w:rPr>
           <w:sz w:val="28"/>
@@ -2205,7 +2308,8 @@
     </w:p>
     <w:p>
       <w:pPr>
-        <w:spacing w:before="240" w:after="240"/>
+        <w:spacing w:before="240" w:after="120"/>
+        <w:ind w:firstLine="709"/>
         <w:jc w:val="center"/>
         <w:rPr>
           <w:sz w:val="28"/>
@@ -2259,7 +2363,7 @@
     </w:p>
     <w:p>
       <w:pPr>
-        <w:spacing w:before="240" w:after="240"/>
+        <w:ind w:firstLine="709"/>
         <w:jc w:val="center"/>
         <w:rPr>
           <w:sz w:val="28"/>
@@ -2273,6 +2377,7 @@
         </w:rPr>
         <w:t xml:space="preserve">Рисунок 3.1 – Создание резервной копии файла </w:t>
       </w:r>
+      <w:proofErr w:type="spellStart"/>
       <w:r>
         <w:rPr>
           <w:sz w:val="28"/>
@@ -2281,6 +2386,7 @@
         </w:rPr>
         <w:t>sshd</w:t>
       </w:r>
+      <w:proofErr w:type="spellEnd"/>
       <w:r>
         <w:rPr>
           <w:sz w:val="28"/>
@@ -2299,8 +2405,8 @@
     </w:p>
     <w:p>
       <w:pPr>
-        <w:spacing w:before="240" w:after="240"/>
-        <w:ind w:left="708" w:firstLine="708"/>
+        <w:spacing w:before="240"/>
+        <w:ind w:firstLine="708"/>
         <w:jc w:val="both"/>
         <w:rPr>
           <w:sz w:val="28"/>
@@ -2314,6 +2420,7 @@
         </w:rPr>
         <w:t xml:space="preserve">Следующим шагом нужно открыть файл </w:t>
       </w:r>
+      <w:proofErr w:type="spellStart"/>
       <w:r>
         <w:rPr>
           <w:sz w:val="28"/>
@@ -2322,6 +2429,7 @@
         </w:rPr>
         <w:t>sshd</w:t>
       </w:r>
+      <w:proofErr w:type="spellEnd"/>
       <w:r>
         <w:rPr>
           <w:sz w:val="28"/>
@@ -2383,7 +2491,8 @@
     </w:p>
     <w:p>
       <w:pPr>
-        <w:spacing w:before="240" w:after="240"/>
+        <w:spacing w:before="240" w:after="120"/>
+        <w:ind w:firstLine="709"/>
         <w:jc w:val="center"/>
         <w:rPr>
           <w:sz w:val="28"/>
@@ -2435,7 +2544,7 @@
     </w:p>
     <w:p>
       <w:pPr>
-        <w:spacing w:before="240" w:after="240"/>
+        <w:ind w:firstLine="709"/>
         <w:jc w:val="center"/>
         <w:rPr>
           <w:sz w:val="28"/>
@@ -2449,6 +2558,7 @@
         </w:rPr>
         <w:t xml:space="preserve">Рисунок 3.2 – Результат изменения файла </w:t>
       </w:r>
+      <w:proofErr w:type="spellStart"/>
       <w:r>
         <w:rPr>
           <w:sz w:val="28"/>
@@ -2457,6 +2567,7 @@
         </w:rPr>
         <w:t>sshd</w:t>
       </w:r>
+      <w:proofErr w:type="spellEnd"/>
       <w:r>
         <w:rPr>
           <w:sz w:val="28"/>
@@ -2475,7 +2586,8 @@
     </w:p>
     <w:p>
       <w:pPr>
-        <w:spacing w:before="240" w:after="240"/>
+        <w:spacing w:before="240"/>
+        <w:ind w:firstLine="708"/>
         <w:jc w:val="both"/>
         <w:rPr>
           <w:sz w:val="28"/>
@@ -2487,13 +2599,6 @@
           <w:sz w:val="28"/>
           <w:szCs w:val="28"/>
         </w:rPr>
-        <w:tab/>
-      </w:r>
-      <w:r>
-        <w:rPr>
-          <w:sz w:val="28"/>
-          <w:szCs w:val="28"/>
-        </w:rPr>
         <w:t xml:space="preserve">Далее необходимо перезапустить службу </w:t>
       </w:r>
       <w:r>
@@ -2518,6 +2623,7 @@
         </w:rPr>
         <w:t xml:space="preserve">и установить свой </w:t>
       </w:r>
+      <w:proofErr w:type="spellStart"/>
       <w:r>
         <w:rPr>
           <w:sz w:val="28"/>
@@ -2526,6 +2632,7 @@
         </w:rPr>
         <w:t>ip</w:t>
       </w:r>
+      <w:proofErr w:type="spellEnd"/>
       <w:r>
         <w:rPr>
           <w:sz w:val="28"/>
@@ -2562,6 +2669,7 @@
         </w:rPr>
         <w:t xml:space="preserve">с помощью команды </w:t>
       </w:r>
+      <w:proofErr w:type="spellStart"/>
       <w:r>
         <w:rPr>
           <w:sz w:val="28"/>
@@ -2570,6 +2678,7 @@
         </w:rPr>
         <w:t>ip</w:t>
       </w:r>
+      <w:proofErr w:type="spellEnd"/>
       <w:r>
         <w:rPr>
           <w:sz w:val="28"/>
@@ -2631,8 +2740,7 @@
     </w:p>
     <w:p>
       <w:pPr>
-        <w:spacing w:before="240" w:after="240"/>
-        <w:jc w:val="center"/>
+        <w:spacing w:after="120"/>
         <w:rPr>
           <w:sz w:val="28"/>
           <w:szCs w:val="28"/>
@@ -2646,7 +2754,7 @@
         </w:rPr>
         <w:lastRenderedPageBreak/>
         <w:drawing>
-          <wp:inline distT="0" distB="0" distL="0" distR="0" wp14:anchorId="3C77AEEC" wp14:editId="62BA65A5">
+          <wp:inline distT="0" distB="0" distL="0" distR="0" wp14:anchorId="54E23C2C" wp14:editId="398C11B8">
             <wp:extent cx="6372225" cy="2199005"/>
             <wp:effectExtent l="0" t="0" r="9525" b="0"/>
             <wp:docPr id="15" name="Рисунок 15"/>
@@ -2684,7 +2792,7 @@
     </w:p>
     <w:p>
       <w:pPr>
-        <w:spacing w:before="240" w:after="240"/>
+        <w:ind w:firstLine="709"/>
         <w:jc w:val="center"/>
         <w:rPr>
           <w:sz w:val="28"/>
@@ -2720,6 +2828,7 @@
         </w:rPr>
         <w:t xml:space="preserve">и определения своего </w:t>
       </w:r>
+      <w:proofErr w:type="spellStart"/>
       <w:r>
         <w:rPr>
           <w:sz w:val="28"/>
@@ -2728,6 +2837,7 @@
         </w:rPr>
         <w:t>ip</w:t>
       </w:r>
+      <w:proofErr w:type="spellEnd"/>
       <w:r>
         <w:rPr>
           <w:sz w:val="28"/>
@@ -2738,7 +2848,8 @@
     </w:p>
     <w:p>
       <w:pPr>
-        <w:spacing w:before="240" w:after="240"/>
+        <w:spacing w:before="240"/>
+        <w:ind w:firstLine="708"/>
         <w:jc w:val="both"/>
         <w:rPr>
           <w:sz w:val="28"/>
@@ -2750,7 +2861,6 @@
           <w:sz w:val="28"/>
           <w:szCs w:val="28"/>
         </w:rPr>
-        <w:tab/>
         <w:t xml:space="preserve">Последним пунктом необходимо было запустить терминальный клиент </w:t>
       </w:r>
       <w:r>
@@ -2768,6 +2878,7 @@
         </w:rPr>
         <w:t xml:space="preserve">, ввести полученный в предыдущем пункте </w:t>
       </w:r>
+      <w:proofErr w:type="spellStart"/>
       <w:r>
         <w:rPr>
           <w:sz w:val="28"/>
@@ -2776,6 +2887,7 @@
         </w:rPr>
         <w:t>ip</w:t>
       </w:r>
+      <w:proofErr w:type="spellEnd"/>
       <w:r>
         <w:rPr>
           <w:sz w:val="28"/>
@@ -2793,7 +2905,8 @@
     </w:p>
     <w:p>
       <w:pPr>
-        <w:spacing w:before="240" w:after="240"/>
+        <w:spacing w:before="240" w:after="120"/>
+        <w:jc w:val="center"/>
         <w:rPr>
           <w:sz w:val="28"/>
           <w:szCs w:val="28"/>
@@ -2806,7 +2919,7 @@
           <w:szCs w:val="28"/>
         </w:rPr>
         <w:drawing>
-          <wp:inline distT="0" distB="0" distL="0" distR="0" wp14:anchorId="50CE3A06" wp14:editId="034DB0D6">
+          <wp:inline distT="0" distB="0" distL="0" distR="0" wp14:anchorId="7A04FFF3" wp14:editId="10747F8A">
             <wp:extent cx="6372225" cy="3971290"/>
             <wp:effectExtent l="0" t="0" r="9525" b="0"/>
             <wp:docPr id="17" name="Рисунок 17"/>
@@ -2844,11 +2957,12 @@
     </w:p>
     <w:p>
       <w:pPr>
-        <w:spacing w:before="240" w:after="240"/>
-        <w:jc w:val="center"/>
-        <w:rPr>
-          <w:sz w:val="28"/>
-          <w:szCs w:val="28"/>
+        <w:ind w:firstLine="709"/>
+        <w:jc w:val="both"/>
+        <w:rPr>
+          <w:sz w:val="28"/>
+          <w:szCs w:val="28"/>
+          <w:lang w:val="en-US"/>
         </w:rPr>
       </w:pPr>
       <w:r>
@@ -2869,11 +2983,83 @@
     </w:p>
     <w:p>
       <w:pPr>
-        <w:spacing w:before="240" w:after="240"/>
+        <w:spacing w:before="240"/>
+        <w:ind w:firstLine="708"/>
         <w:jc w:val="both"/>
         <w:rPr>
           <w:sz w:val="28"/>
           <w:szCs w:val="28"/>
+          <w:lang w:val="be-BY"/>
+        </w:rPr>
+      </w:pPr>
+      <w:r>
+        <w:rPr>
+          <w:sz w:val="28"/>
+          <w:szCs w:val="28"/>
+        </w:rPr>
+        <w:t xml:space="preserve">В результате данного раздела был установлен и конфигурирован </w:t>
+      </w:r>
+      <w:r>
+        <w:rPr>
+          <w:sz w:val="28"/>
+          <w:szCs w:val="28"/>
+          <w:lang w:val="en-US"/>
+        </w:rPr>
+        <w:t>OpenSSH</w:t>
+      </w:r>
+      <w:r>
+        <w:rPr>
+          <w:sz w:val="28"/>
+          <w:szCs w:val="28"/>
+        </w:rPr>
+        <w:t xml:space="preserve"> </w:t>
+      </w:r>
+      <w:r>
+        <w:rPr>
+          <w:sz w:val="28"/>
+          <w:szCs w:val="28"/>
+          <w:lang w:val="en-US"/>
+        </w:rPr>
+        <w:t>Server</w:t>
+      </w:r>
+      <w:r>
+        <w:rPr>
+          <w:sz w:val="28"/>
+          <w:szCs w:val="28"/>
+        </w:rPr>
+        <w:t xml:space="preserve">, проведены необходимые манипуляции и осуществлена проверка через терминальный клиент </w:t>
+      </w:r>
+      <w:r>
+        <w:rPr>
+          <w:sz w:val="28"/>
+          <w:szCs w:val="28"/>
+          <w:lang w:val="en-US"/>
+        </w:rPr>
+        <w:t>PuTTY</w:t>
+      </w:r>
+      <w:r>
+        <w:rPr>
+          <w:sz w:val="28"/>
+          <w:szCs w:val="28"/>
+        </w:rPr>
+        <w:t xml:space="preserve"> </w:t>
+      </w:r>
+      <w:r>
+        <w:rPr>
+          <w:sz w:val="28"/>
+          <w:szCs w:val="28"/>
+          <w:lang w:val="be-BY"/>
+        </w:rPr>
+        <w:t>с физической машины.</w:t>
+      </w:r>
+    </w:p>
+    <w:p>
+      <w:pPr>
+        <w:ind w:firstLine="709"/>
+        <w:jc w:val="both"/>
+        <w:rPr>
+          <w:sz w:val="28"/>
+          <w:szCs w:val="28"/>
         </w:rPr>
       </w:pPr>
       <w:r>
@@ -2886,24 +3072,7 @@
     </w:p>
     <w:p>
       <w:pPr>
-        <w:spacing w:before="240" w:after="240"/>
-        <w:rPr>
-          <w:sz w:val="28"/>
-          <w:szCs w:val="28"/>
-        </w:rPr>
-      </w:pPr>
-    </w:p>
-    <w:p>
-      <w:pPr>
-        <w:jc w:val="center"/>
-        <w:rPr>
-          <w:sz w:val="28"/>
-          <w:szCs w:val="28"/>
-        </w:rPr>
-      </w:pPr>
-    </w:p>
-    <w:p>
-      <w:pPr>
+        <w:jc w:val="both"/>
         <w:rPr>
           <w:sz w:val="28"/>
           <w:szCs w:val="28"/>

</xml_diff>